<commit_message>
Revise quiz wording for self-contained exam questions
</commit_message>
<xml_diff>
--- a/NLP_270_cau_QUIZ_va_dap_an.docx
+++ b/NLP_270_cau_QUIZ_va_dap_an.docx
@@ -1229,7 +1229,7 @@
         <w:t xml:space="preserve">Câu 011. </w:t>
       </w:r>
       <w:r>
-        <w:t>Theo bài giảng, đặc trưng hình thái nổi bật của tiếng Việt là gì?</w:t>
+        <w:t>Đặc trưng hình thái nổi bật của tiếng Việt là gì?</w:t>
       </w:r>
     </w:p>
     <w:p>
@@ -1406,7 +1406,7 @@
         <w:t xml:space="preserve">Câu 014. </w:t>
       </w:r>
       <w:r>
-        <w:t>Theo bộ nhãn Penn Treebank trong ví dụ, NN biểu thị loại từ nào?</w:t>
+        <w:t>Trong bộ nhãn Penn Treebank, NN biểu thị loại từ nào?</w:t>
       </w:r>
     </w:p>
     <w:p>
@@ -1701,7 +1701,7 @@
         <w:t xml:space="preserve">Câu 019. </w:t>
       </w:r>
       <w:r>
-        <w:t>Trong pipeline ở bài giảng, đầu ra của phân tích cú pháp là gì?</w:t>
+        <w:t>Đầu ra của phân tích cú pháp trong pipeline NLP là gì?</w:t>
       </w:r>
     </w:p>
     <w:p>
@@ -1760,7 +1760,7 @@
         <w:t xml:space="preserve">Câu 020. </w:t>
       </w:r>
       <w:r>
-        <w:t>ELIZA trong bài giảng là ví dụ về hệ thống nào?</w:t>
+        <w:t>ELIZA là ví dụ về hệ thống nào?</w:t>
       </w:r>
     </w:p>
     <w:p>
@@ -2368,7 +2368,7 @@
         <w:t xml:space="preserve">Câu 030. </w:t>
       </w:r>
       <w:r>
-        <w:t>Ký hiệu &lt;s&gt; và &lt;/s&gt; trong ví dụ bigram đánh dấu điều gì?</w:t>
+        <w:t>Trong mô hình bigram, ký hiệu &lt;s&gt; và &lt;/s&gt; đánh dấu điều gì?</w:t>
       </w:r>
     </w:p>
     <w:p>
@@ -2486,7 +2486,7 @@
         <w:t xml:space="preserve">Câu 032. </w:t>
       </w:r>
       <w:r>
-        <w:t>KenLM là công cụ thuộc nhóm nào trong bài giảng?</w:t>
+        <w:t>KenLM thuộc nhóm công cụ nào?</w:t>
       </w:r>
     </w:p>
     <w:p>
@@ -2604,7 +2604,7 @@
         <w:t xml:space="preserve">Câu 034. </w:t>
       </w:r>
       <w:r>
-        <w:t>Độ đo đánh giá trong nào được nêu cho mô hình ngôn ngữ?</w:t>
+        <w:t>Độ đo nào thường dùng để đánh giá nội tại mô hình ngôn ngữ?</w:t>
       </w:r>
     </w:p>
     <w:p>
@@ -3035,7 +3035,7 @@
         <w:t xml:space="preserve">Câu 041. </w:t>
       </w:r>
       <w:r>
-        <w:t>Từ đơn trong bài giảng được cấu tạo như thế nào?</w:t>
+        <w:t>Từ đơn tiếng Việt được cấu tạo như thế nào?</w:t>
       </w:r>
     </w:p>
     <w:p>
@@ -3212,7 +3212,7 @@
         <w:t xml:space="preserve">Câu 044. </w:t>
       </w:r>
       <w:r>
-        <w:t>Trong hướng xử lý ở bài giảng, email và URL thường được nhận dạng bằng gì?</w:t>
+        <w:t>Email và URL thường được nhận dạng bằng kỹ thuật nào khi tiền xử lý văn bản?</w:t>
       </w:r>
     </w:p>
     <w:p>
@@ -3448,7 +3448,7 @@
         <w:t xml:space="preserve">Câu 048. </w:t>
       </w:r>
       <w:r>
-        <w:t>Ưu điểm nào được nêu cho thuật toán so khớp từ dài nhất?</w:t>
+        <w:t>Ưu điểm nào đúng với thuật toán so khớp từ dài nhất?</w:t>
       </w:r>
     </w:p>
     <w:p>
@@ -3802,7 +3802,7 @@
         <w:t xml:space="preserve">Câu 054. </w:t>
       </w:r>
       <w:r>
-        <w:t>VnTokenizer trong bài giảng sử dụng hướng tiếp cận nào?</w:t>
+        <w:t>VnTokenizer sử dụng hướng tiếp cận nào?</w:t>
       </w:r>
     </w:p>
     <w:p>
@@ -4115,7 +4115,7 @@
         <w:t xml:space="preserve">Câu 059. </w:t>
       </w:r>
       <w:r>
-        <w:t>Theo bài giảng, bộ nhãn Penn Treebank thường có bao nhiêu nhãn?</w:t>
+        <w:t>Bộ nhãn Penn Treebank thường có bao nhiêu nhãn?</w:t>
       </w:r>
     </w:p>
     <w:p>
@@ -4941,7 +4941,7 @@
         <w:t xml:space="preserve">Câu 073. </w:t>
       </w:r>
       <w:r>
-        <w:t>Theo luật minh họa, race/NN đứng ngay sau TO nên được sửa thành nhãn nào?</w:t>
+        <w:t>Trong cụm to/TO race/NN, nhãn NN của race nên được sửa thành nhãn nào?</w:t>
       </w:r>
     </w:p>
     <w:p>
@@ -5000,7 +5000,7 @@
         <w:t xml:space="preserve">Câu 074. </w:t>
       </w:r>
       <w:r>
-        <w:t>Điểm của một luật TBL trong bài giảng được tính như thế nào?</w:t>
+        <w:t>Điểm của một luật TBL được tính như thế nào?</w:t>
       </w:r>
     </w:p>
     <w:p>
@@ -5059,7 +5059,7 @@
         <w:t xml:space="preserve">Câu 075. </w:t>
       </w:r>
       <w:r>
-        <w:t>Theo bảng nhãn tiếng Việt được giới thiệu, nhãn N biểu thị gì?</w:t>
+        <w:t>Trong bộ nhãn từ loại tiếng Việt dùng N, V, A, M, nhãn N biểu thị gì?</w:t>
       </w:r>
     </w:p>
     <w:p>
@@ -5118,7 +5118,7 @@
         <w:t xml:space="preserve">Câu 076. </w:t>
       </w:r>
       <w:r>
-        <w:t>JvnTagger trong bài giảng sử dụng những mô hình nào?</w:t>
+        <w:t>JvnTagger sử dụng những mô hình nào?</w:t>
       </w:r>
     </w:p>
     <w:p>
@@ -5254,7 +5254,7 @@
         <w:t xml:space="preserve">Câu 078. </w:t>
       </w:r>
       <w:r>
-        <w:t>Đầu ra điển hình của bài toán parsing trong bài giảng là gì?</w:t>
+        <w:t>Đầu ra điển hình của bài toán parsing là gì?</w:t>
       </w:r>
     </w:p>
     <w:p>
@@ -5903,7 +5903,7 @@
         <w:t xml:space="preserve">Câu 089. </w:t>
       </w:r>
       <w:r>
-        <w:t>CKY tiêu chuẩn trong bài giảng yêu cầu văn phạm ở dạng nào?</w:t>
+        <w:t>CKY tiêu chuẩn yêu cầu văn phạm ở dạng nào?</w:t>
       </w:r>
     </w:p>
     <w:p>
@@ -6198,7 +6198,7 @@
         <w:t xml:space="preserve">Câu 094. </w:t>
       </w:r>
       <w:r>
-        <w:t>Bước Attach trong cách trình bày Earley ở slide tương ứng với thao tác nào?</w:t>
+        <w:t>Trong Earley, bước Complete (còn gọi là Attach) thực hiện thao tác nào?</w:t>
       </w:r>
     </w:p>
     <w:p>
@@ -6257,7 +6257,7 @@
         <w:t xml:space="preserve">Câu 095. </w:t>
       </w:r>
       <w:r>
-        <w:t>Độ phức tạp thời gian tổng quát được nêu cho CKY và Earley là gì?</w:t>
+        <w:t>Độ phức tạp thời gian trường hợp xấu nhất của CKY và Earley là gì?</w:t>
       </w:r>
     </w:p>
     <w:p>
@@ -6511,7 +6511,7 @@
         <w:t xml:space="preserve">Câu 099. </w:t>
       </w:r>
       <w:r>
-        <w:t>Đầu vào của bài toán SRL trong bài giảng gồm những gì?</w:t>
+        <w:t>Đầu vào của bài toán SRL gồm những gì?</w:t>
       </w:r>
     </w:p>
     <w:p>
@@ -6570,7 +6570,7 @@
         <w:t xml:space="preserve">Câu 100. </w:t>
       </w:r>
       <w:r>
-        <w:t>Trong ví dụ Kristina hit Scott, Kristina giữ vai trò nào?</w:t>
+        <w:t>Trong câu “Kristina hit Scott”, Kristina giữ vai trò nào?</w:t>
       </w:r>
     </w:p>
     <w:p>
@@ -6629,7 +6629,7 @@
         <w:t xml:space="preserve">Câu 101. </w:t>
       </w:r>
       <w:r>
-        <w:t>Trong ví dụ Kristina hit Scott, Scott giữ vai trò nào?</w:t>
+        <w:t>Trong câu “Kristina hit Scott”, Scott giữ vai trò nào?</w:t>
       </w:r>
     </w:p>
     <w:p>
@@ -6688,7 +6688,7 @@
         <w:t xml:space="preserve">Câu 102. </w:t>
       </w:r>
       <w:r>
-        <w:t>Trong ví dụ Kristina hit Scott with a baseball, with a baseball biểu thị gì?</w:t>
+        <w:t>Trong câu “Kristina hit Scott with a baseball”, with a baseball biểu thị gì?</w:t>
       </w:r>
     </w:p>
     <w:p>
@@ -6747,7 +6747,7 @@
         <w:t xml:space="preserve">Câu 103. </w:t>
       </w:r>
       <w:r>
-        <w:t>Trong ví dụ hit ở bài giảng, yesterday biểu thị vai nghĩa nào?</w:t>
+        <w:t>Trong câu “Kristina hit Scott yesterday”, yesterday biểu thị vai nghĩa nào?</w:t>
       </w:r>
     </w:p>
     <w:p>
@@ -7455,7 +7455,7 @@
         <w:t xml:space="preserve">Câu 115. </w:t>
       </w:r>
       <w:r>
-        <w:t>Trong sơ đồ IOB, tiền tố B- biểu thị điều gì?</w:t>
+        <w:t>Trong hệ nhãn chuỗi IOB, tiền tố B- biểu thị điều gì?</w:t>
       </w:r>
     </w:p>
     <w:p>
@@ -7514,7 +7514,7 @@
         <w:t xml:space="preserve">Câu 116. </w:t>
       </w:r>
       <w:r>
-        <w:t>Một ưu điểm của SRL end-to-end DB-LSTM được nêu là gì?</w:t>
+        <w:t>Một ưu điểm của SRL end-to-end DB-LSTM là gì?</w:t>
       </w:r>
     </w:p>
     <w:p>
@@ -8299,7 +8299,7 @@
         <w:t xml:space="preserve">Câu 129. </w:t>
       </w:r>
       <w:r>
-        <w:t>Ưu điểm nào của Lesk được nêu trong slide?</w:t>
+        <w:t>Thuật toán Lesk có ưu điểm nào sau đây?</w:t>
       </w:r>
     </w:p>
     <w:p>
@@ -8417,7 +8417,7 @@
         <w:t xml:space="preserve">Câu 131. </w:t>
       </w:r>
       <w:r>
-        <w:t>Nhược điểm chính của one-hot encoding được nêu là gì?</w:t>
+        <w:t>Nhược điểm chính của one-hot encoding là gì?</w:t>
       </w:r>
     </w:p>
     <w:p>
@@ -8907,7 +8907,7 @@
         <w:t xml:space="preserve">Câu 139. </w:t>
       </w:r>
       <w:r>
-        <w:t>QA là viết tắt của gì trong bài giảng?</w:t>
+        <w:t>QA là viết tắt của gì trong xử lý ngôn ngữ tự nhiên?</w:t>
       </w:r>
     </w:p>
     <w:p>
@@ -9084,7 +9084,7 @@
         <w:t xml:space="preserve">Câu 142. </w:t>
       </w:r>
       <w:r>
-        <w:t>AskMSR được giới thiệu là cách tiếp cận nào?</w:t>
+        <w:t>AskMSR thuộc kiểu tiếp cận QA nào?</w:t>
       </w:r>
     </w:p>
     <w:p>
@@ -9556,7 +9556,7 @@
         <w:t xml:space="preserve">Câu 150. </w:t>
       </w:r>
       <w:r>
-        <w:t>LCC trong bài giảng đại diện cho hướng QA nào?</w:t>
+        <w:t>LCC đại diện cho hướng tiếp cận QA nào?</w:t>
       </w:r>
     </w:p>
     <w:p>
@@ -9792,7 +9792,7 @@
         <w:t xml:space="preserve">Câu 154. </w:t>
       </w:r>
       <w:r>
-        <w:t>Phương pháp ISI trong bài giảng học điều gì từ các cặp hỏi–đáp?</w:t>
+        <w:t>Phương pháp ISI học điều gì từ các cặp hỏi–đáp?</w:t>
       </w:r>
     </w:p>
     <w:p>
@@ -9910,7 +9910,7 @@
         <w:t xml:space="preserve">Câu 156. </w:t>
       </w:r>
       <w:r>
-        <w:t>VLSP 2020 QA trong bài giảng gắn với ngôn ngữ nào?</w:t>
+        <w:t>VLSP 2020 QA là tập dữ liệu hỏi đáp của ngôn ngữ nào?</w:t>
       </w:r>
     </w:p>
     <w:p>
@@ -10400,7 +10400,7 @@
         <w:t xml:space="preserve">Câu 164. </w:t>
       </w:r>
       <w:r>
-        <w:t>Trong ký hiệu của slide, F là câu nguồn và E là câu đích. Bộ giải mã cần tìm gì?</w:t>
+        <w:t>Cho F là câu nguồn và E là câu đích. Bộ giải mã SMT cần tìm gì?</w:t>
       </w:r>
     </w:p>
     <w:p>
@@ -10990,7 +10990,7 @@
         <w:t xml:space="preserve">Câu 174. </w:t>
       </w:r>
       <w:r>
-        <w:t>GIZA++ trong bài giảng được dùng chủ yếu để làm gì?</w:t>
+        <w:t>GIZA++ được dùng chủ yếu để làm gì?</w:t>
       </w:r>
     </w:p>
     <w:p>
@@ -11362,7 +11362,7 @@
         <w:t xml:space="preserve">Câu 180. </w:t>
       </w:r>
       <w:r>
-        <w:t>Clustering trong cách mô tả IE của bài giảng có vai trò gì?</w:t>
+        <w:t>Trong IE, thao tác clustering các tham chiếu thực thể có vai trò gì?</w:t>
       </w:r>
     </w:p>
     <w:p>
@@ -11421,7 +11421,7 @@
         <w:t xml:space="preserve">Câu 181. </w:t>
       </w:r>
       <w:r>
-        <w:t>Bước nào đứng trước IE trong pipeline thu thập tài liệu ở slide?</w:t>
+        <w:t>Sau khi thu thập tài liệu web, bước nào thường được thực hiện ngay trước trích rút thông tin?</w:t>
       </w:r>
     </w:p>
     <w:p>
@@ -11716,7 +11716,7 @@
         <w:t xml:space="preserve">Câu 186. </w:t>
       </w:r>
       <w:r>
-        <w:t>Ưu điểm được nêu của NER dựa trên luật thủ công là gì?</w:t>
+        <w:t>Ưu điểm của NER dựa trên luật thủ công là gì?</w:t>
       </w:r>
     </w:p>
     <w:p>
@@ -11834,7 +11834,7 @@
         <w:t xml:space="preserve">Câu 188. </w:t>
       </w:r>
       <w:r>
-        <w:t>GATE là gì theo bài giảng?</w:t>
+        <w:t>GATE là loại công cụ nào?</w:t>
       </w:r>
     </w:p>
     <w:p>
@@ -11893,7 +11893,7 @@
         <w:t xml:space="preserve">Câu 189. </w:t>
       </w:r>
       <w:r>
-        <w:t>Ba phần của cửa sổ trượt trong mô hình IE được nêu là gì?</w:t>
+        <w:t>Ba phần của cửa sổ trượt trong mô hình IE là gì?</w:t>
       </w:r>
     </w:p>
     <w:p>
@@ -12011,7 +12011,7 @@
         <w:t xml:space="preserve">Câu 191. </w:t>
       </w:r>
       <w:r>
-        <w:t>Thuật toán nào tìm chuỗi trạng thái tốt nhất cho HMM trong bài giảng?</w:t>
+        <w:t>Thuật toán nào tìm chuỗi trạng thái tốt nhất cho HMM?</w:t>
       </w:r>
     </w:p>
     <w:p>
@@ -12129,7 +12129,7 @@
         <w:t xml:space="preserve">Câu 193. </w:t>
       </w:r>
       <w:r>
-        <w:t>Ưu điểm nào của CRF so với các giả thiết đơn giản của HMM được nêu?</w:t>
+        <w:t>So với HMM, CRF có ưu điểm nào về việc sử dụng đặc trưng?</w:t>
       </w:r>
     </w:p>
     <w:p>
@@ -12560,7 +12560,7 @@
         <w:t xml:space="preserve">Câu 200. </w:t>
       </w:r>
       <w:r>
-        <w:t>Trong LAB 1, Stanza thuộc nhóm công cụ nào?</w:t>
+        <w:t>Stanza thuộc nhóm công cụ nào?</w:t>
       </w:r>
     </w:p>
     <w:p>
@@ -12619,7 +12619,7 @@
         <w:t xml:space="preserve">Câu 201. </w:t>
       </w:r>
       <w:r>
-        <w:t>requests.get() trong bài thu thập dữ liệu được dùng để làm gì?</w:t>
+        <w:t>requests.get() có chức năng gì khi thu thập dữ liệu web?</w:t>
       </w:r>
     </w:p>
     <w:p>
@@ -12737,7 +12737,7 @@
         <w:t xml:space="preserve">Câu 203. </w:t>
       </w:r>
       <w:r>
-        <w:t>DataFrame.to_csv() trong bài crawl có tác dụng gì?</w:t>
+        <w:t>DataFrame.to_csv() có tác dụng gì?</w:t>
       </w:r>
     </w:p>
     <w:p>
@@ -12914,7 +12914,7 @@
         <w:t xml:space="preserve">Câu 206. </w:t>
       </w:r>
       <w:r>
-        <w:t>Lớp nào được dùng để tạo ma trận TF-IDF trong notebook?</w:t>
+        <w:t>Trong scikit-learn, lớp nào được dùng để tạo ma trận TF-IDF?</w:t>
       </w:r>
     </w:p>
     <w:p>
@@ -13032,7 +13032,7 @@
         <w:t xml:space="preserve">Câu 208. </w:t>
       </w:r>
       <w:r>
-        <w:t>get_feature_names_out() trong LAB 3 dùng để lấy gì?</w:t>
+        <w:t>get_feature_names_out() của vectorizer dùng để lấy gì?</w:t>
       </w:r>
     </w:p>
     <w:p>
@@ -13209,7 +13209,7 @@
         <w:t xml:space="preserve">Câu 211. </w:t>
       </w:r>
       <w:r>
-        <w:t>pipeline('sentiment-analysis', ...) trong LAB 4A được dùng để làm gì?</w:t>
+        <w:t>pipeline('sentiment-analysis', ...) được dùng để làm gì?</w:t>
       </w:r>
     </w:p>
     <w:p>
@@ -13327,7 +13327,7 @@
         <w:t xml:space="preserve">Câu 213. </w:t>
       </w:r>
       <w:r>
-        <w:t>Mô hình distilbert-base-uncased-finetuned-sst-2-english trong ví dụ chủ yếu trả những nhãn nào?</w:t>
+        <w:t>Mô hình phân tích cảm xúc nhị phân tích cực–tiêu cực trả những nhãn nào?</w:t>
       </w:r>
     </w:p>
     <w:p>
@@ -13504,7 +13504,7 @@
         <w:t xml:space="preserve">Câu 216. </w:t>
       </w:r>
       <w:r>
-        <w:t>Theo ngưỡng trong notebook, compound ≥ 0,05 được xếp loại gì?</w:t>
+        <w:t>Theo quy tắc phân loại VADER với ngưỡng ±0,05, compound ≥ 0,05 được xếp loại gì?</w:t>
       </w:r>
     </w:p>
     <w:p>
@@ -14094,7 +14094,7 @@
         <w:t xml:space="preserve">Câu 226. </w:t>
       </w:r>
       <w:r>
-        <w:t>Trình tự xử lý NER trong LAB 9 là gì?</w:t>
+        <w:t>Trình tự xử lý NER bằng các hàm word_tokenize(), pos_tag() và ne_chunk() là gì?</w:t>
       </w:r>
     </w:p>
     <w:p>
@@ -14153,7 +14153,7 @@
         <w:t xml:space="preserve">Câu 227. </w:t>
       </w:r>
       <w:r>
-        <w:t>subtree.label() trong phần duyệt kết quả NER dùng để lấy gì?</w:t>
+        <w:t>subtree.label() của một cây con trong kết quả NER dùng để lấy gì?</w:t>
       </w:r>
     </w:p>
     <w:p>
@@ -14212,7 +14212,7 @@
         <w:t xml:space="preserve">Câu 228. </w:t>
       </w:r>
       <w:r>
-        <w:t>RegexpParser trong LAB 10 được sử dụng để làm gì?</w:t>
+        <w:t>RegexpParser trong NLTK được sử dụng để làm gì?</w:t>
       </w:r>
     </w:p>
     <w:p>
@@ -14389,7 +14389,7 @@
         <w:t xml:space="preserve">Câu 231. </w:t>
       </w:r>
       <w:r>
-        <w:t>CountVectorizer() mặc định trong bài phân loại văn bản tạo loại đặc trưng nào?</w:t>
+        <w:t>CountVectorizer() mặc định tạo loại đặc trưng văn bản nào?</w:t>
       </w:r>
     </w:p>
     <w:p>
@@ -14448,7 +14448,7 @@
         <w:t xml:space="preserve">Câu 232. </w:t>
       </w:r>
       <w:r>
-        <w:t>MultinomialNB trong notebook là loại mô hình nào?</w:t>
+        <w:t>MultinomialNB là loại mô hình nào?</w:t>
       </w:r>
     </w:p>
     <w:p>
@@ -14802,7 +14802,7 @@
         <w:t xml:space="preserve">Câu 238. </w:t>
       </w:r>
       <w:r>
-        <w:t>Dense(1, activation='sigmoid') phù hợp đầu ra nào trong ví dụ?</w:t>
+        <w:t>Dense(1, activation='sigmoid') phù hợp với loại đầu ra nào?</w:t>
       </w:r>
     </w:p>
     <w:p>
@@ -14861,7 +14861,7 @@
         <w:t xml:space="preserve">Câu 239. </w:t>
       </w:r>
       <w:r>
-        <w:t>Hàm mất mát nào được dùng trong mô hình IMDB ở notebook?</w:t>
+        <w:t>Với mô hình phân loại cảm xúc IMDB hai lớp và đầu ra sigmoid, hàm mất mát nào phù hợp?</w:t>
       </w:r>
     </w:p>
     <w:p>
@@ -15038,7 +15038,7 @@
         <w:t xml:space="preserve">Câu 242. </w:t>
       </w:r>
       <w:r>
-        <w:t>imdb.load_data(num_words=20000) trong ví dụ dùng để làm gì?</w:t>
+        <w:t>imdb.load_data(num_words=20000) dùng để làm gì?</w:t>
       </w:r>
     </w:p>
     <w:p>
@@ -15233,7 +15233,7 @@
         <w:t xml:space="preserve">Câu 245. </w:t>
       </w:r>
       <w:r>
-        <w:t>fit_transform(train_x) trong ví dụ BoW được dùng để làm gì?</w:t>
+        <w:t>fit_transform(train_x) của CountVectorizer được dùng để làm gì?</w:t>
       </w:r>
     </w:p>
     <w:p>
@@ -15528,7 +15528,7 @@
         <w:t xml:space="preserve">Câu 250. </w:t>
       </w:r>
       <w:r>
-        <w:t>Kết quả nlp(text) trong ví dụ spaCy là loại đối tượng nào?</w:t>
+        <w:t>Trong spaCy, nlp(text) trả về loại đối tượng nào?</w:t>
       </w:r>
     </w:p>
     <w:p>
@@ -15587,7 +15587,7 @@
         <w:t xml:space="preserve">Câu 251. </w:t>
       </w:r>
       <w:r>
-        <w:t>Thuộc tính x.vector của Doc trong phần Word Vectors được dùng để lấy gì?</w:t>
+        <w:t>Thuộc tính x.vector của một Doc trong spaCy được dùng để lấy gì?</w:t>
       </w:r>
     </w:p>
     <w:p>
@@ -15646,7 +15646,7 @@
         <w:t xml:space="preserve">Câu 252. </w:t>
       </w:r>
       <w:r>
-        <w:t>Trong ví dụ Word Vectors, mô hình nào nhận các vector văn bản để phân loại?</w:t>
+        <w:t>Bộ phân loại SVC(kernel='linear') dùng các vector văn bản thuộc loại mô hình nào?</w:t>
       </w:r>
     </w:p>
     <w:p>
@@ -15705,7 +15705,7 @@
         <w:t xml:space="preserve">Câu 253. </w:t>
       </w:r>
       <w:r>
-        <w:t>re.compile() trong phần Regexes thực hiện việc gì?</w:t>
+        <w:t>re.compile() trong Python thực hiện việc gì?</w:t>
       </w:r>
     </w:p>
     <w:p>
@@ -15882,7 +15882,7 @@
         <w:t xml:space="preserve">Câu 256. </w:t>
       </w:r>
       <w:r>
-        <w:t>Dấu lựa chọn trong mẫu ghép read, story và book có tác dụng gì?</w:t>
+        <w:t>Toán tử OR trong biểu thức chính quy có tác dụng gì?</w:t>
       </w:r>
     </w:p>
     <w:p>
@@ -16000,7 +16000,7 @@
         <w:t xml:space="preserve">Câu 258. </w:t>
       </w:r>
       <w:r>
-        <w:t>Lớp nào được dùng cho stemming trong notebook?</w:t>
+        <w:t>Trong NLTK, lớp nào sau đây được dùng cho stemming?</w:t>
       </w:r>
     </w:p>
     <w:p>
@@ -16059,7 +16059,7 @@
         <w:t xml:space="preserve">Câu 259. </w:t>
       </w:r>
       <w:r>
-        <w:t>Lớp nào được dùng cho lemmatization trong notebook?</w:t>
+        <w:t>Trong NLTK, lớp nào sau đây được dùng cho lemmatization?</w:t>
       </w:r>
     </w:p>
     <w:p>
@@ -16354,7 +16354,7 @@
         <w:t xml:space="preserve">Câu 264. </w:t>
       </w:r>
       <w:r>
-        <w:t>Điều kiện word not in stop_words trong notebook dùng để làm gì?</w:t>
+        <w:t>Trong bước lọc từ dừng, điều kiện word not in stop_words dùng để làm gì?</w:t>
       </w:r>
     </w:p>
     <w:p>
@@ -16413,7 +16413,7 @@
         <w:t xml:space="preserve">Câu 265. </w:t>
       </w:r>
       <w:r>
-        <w:t>TextBlob.correct() trong ví dụ có chức năng gì?</w:t>
+        <w:t>TextBlob.correct() có chức năng gì?</w:t>
       </w:r>
     </w:p>
     <w:p>
@@ -16590,7 +16590,7 @@
         <w:t xml:space="preserve">Câu 268. </w:t>
       </w:r>
       <w:r>
-        <w:t>Mục Transformer Architecture trong notebook minh họa hướng biểu diễn nào?</w:t>
+        <w:t>Trong phân loại văn bản, mục đích của bước mã hóa bằng BERT là gì?</w:t>
       </w:r>
     </w:p>
     <w:p>
@@ -16623,7 +16623,7 @@
         <w:ind w:left="198"/>
       </w:pPr>
       <w:r>
-        <w:t>C) Dùng pipeline transformer/BERT để mã hóa văn bản</w:t>
+        <w:t>C) Tạo vector đặc trưng biểu diễn nội dung văn bản</w:t>
       </w:r>
     </w:p>
     <w:p>
@@ -16649,7 +16649,7 @@
         <w:t xml:space="preserve">Câu 269. </w:t>
       </w:r>
       <w:r>
-        <w:t>Trong phần BERT cuối notebook, train_y chứa loại dữ liệu gì?</w:t>
+        <w:t>Với train_y = ['BOOKS', 'BANK', 'BOOKS'], train_y chứa loại dữ liệu gì?</w:t>
       </w:r>
     </w:p>
     <w:p>
@@ -16708,7 +16708,7 @@
         <w:t xml:space="preserve">Câu 270. </w:t>
       </w:r>
       <w:r>
-        <w:t>Trình tự phân loại trong ví dụ cuối notebook là gì?</w:t>
+        <w:t>Một hệ thống dùng BERT tạo vector và SVM phân loại văn bản cần thực hiện theo trình tự nào?</w:t>
       </w:r>
     </w:p>
     <w:p>
@@ -28799,15 +28799,15 @@
         <w:rPr>
           <w:b/>
         </w:rPr>
-        <w:t>Câu 268 — C) Dùng pipeline transformer/BERT để mã hóa văn bản</w:t>
-      </w:r>
-    </w:p>
-    <w:p>
-      <w:pPr>
-        <w:keepNext/>
-      </w:pPr>
-      <w:r>
-        <w:t>Notebook nạp pipeline transformer rồi dùng kết quả xử lý làm đặc trưng.</w:t>
+        <w:t>Câu 268 — C) Tạo vector đặc trưng biểu diễn nội dung văn bản</w:t>
+      </w:r>
+    </w:p>
+    <w:p>
+      <w:pPr>
+        <w:keepNext/>
+      </w:pPr>
+      <w:r>
+        <w:t>BERT mã hóa văn bản thành biểu diễn có thể dùng làm đặc trưng cho bộ phân loại.</w:t>
       </w:r>
     </w:p>
     <w:p>
@@ -28838,7 +28838,7 @@
         <w:keepNext/>
       </w:pPr>
       <w:r>
-        <w:t>Đây là hai lớp chủ đề trong ví dụ phân loại cuối.</w:t>
+        <w:t>Mỗi phần tử của train_y là nhãn lớp tương ứng với một mẫu huấn luyện.</w:t>
       </w:r>
     </w:p>
     <w:p>

</xml_diff>